<commit_message>
v1.9.1: Dialog 900x1000 co dinh + danh sach doan goc cuon duoc
- Width 900px (min 900), height 1000px, canh giua man hinh
- Danh sach doan goc dung CTkScrollableFrame: qua ~6 doan hien thanh cuon, dialog khong phong to
</commit_message>
<xml_diff>
--- a/test/t3.docx
+++ b/test/t3.docx
@@ -4,7 +4,16 @@
   <w:body>
     <w:p>
       <w:r>
-        <w:t>Kính mời Thủ trưởng và các đồng chí lắng nghe bản tin truyền thanh nội bộ của Lữ đoàn 170.</w:t>
+        <w:t xml:space="preserve">Kính mời Thủ trưởng và các đồng chí lắng nghe bản tin truyền thanh nội bộ của Lữ đoàn </w:t>
+      </w:r>
+      <w:r>
+        <w:rPr>
+          <w:lang w:val="en-US"/>
+        </w:rPr>
+        <w:t>một bảy mươi</w:t>
+      </w:r>
+      <w:r>
+        <w:t>.</w:t>
       </w:r>
     </w:p>
     <w:p>
@@ -28,7 +37,16 @@
     </w:p>
     <w:p>
       <w:r>
-        <w:t>Tham dự buổi làm việc có các đồng chí đại biểu Thủ trưởng cơ quan Bộ Tư lệnh Vùng; các đồng chí trong Đảng ủy, Chỉ huy Lữ đoàn 170; lãnh đạo, chỉ huy và cán bộ, chiến sĩ các cơ quan, đơn vị cùng 48 đồng chí cán bộ, giảng viên trong đoàn công tác.</w:t>
+        <w:t xml:space="preserve">Tham dự buổi làm việc có các đồng chí đại biểu Thủ trưởng cơ quan Bộ Tư lệnh Vùng; các đồng chí trong Đảng ủy, Chỉ huy Lữ đoàn </w:t>
+      </w:r>
+      <w:r>
+        <w:rPr>
+          <w:lang w:val="en-US"/>
+        </w:rPr>
+        <w:t>một bảy mươi</w:t>
+      </w:r>
+      <w:r>
+        <w:t>; lãnh đạo, chỉ huy và cán bộ, chiến sĩ các cơ quan, đơn vị cùng 48 đồng chí cán bộ, giảng viên trong đoàn công tác.</w:t>
       </w:r>
     </w:p>
     <w:p>
@@ -43,7 +61,16 @@
     </w:p>
     <w:p>
       <w:r>
-        <w:t>Phát biểu tại buổi làm việc, đồng chí Phó Giáo sư, Tiến sĩ Nguyễn Thắng Lợi bày tỏ cảm ơn sự đón tiếp chu đáo, trọng thị của Bộ Tư lệnh Vùng 1 Hải quân và Lữ đoàn 170; đồng thời chia sẻ những kinh nghiệm trong nghiên cứu lý luận chính trị, tổng kết thực tiễn và trao đổi các vấn đề liên quan đến công tác bảo vệ nền tảng tư tưởng của Đảng. Đồng chí nhấn mạnh ý nghĩa của việc tăng cường gắn kết giữa nghiên cứu lý luận với thực tiễn hoạt động của các đơn vị Quân đội, qua đó góp phần bổ sung cơ sở thực tiễn phục vụ công tác nghiên cứu, phát triển lý luận và nâng cao hiệu quả thực hiện nhiệm vụ trong tình hình mới.</w:t>
+        <w:t xml:space="preserve">Phát biểu tại buổi làm việc, đồng chí Phó Giáo sư, Tiến sĩ Nguyễn Thắng Lợi bày tỏ cảm ơn sự đón tiếp chu đáo, trọng thị của Bộ Tư lệnh Vùng 1 Hải quân và Lữ đoàn </w:t>
+      </w:r>
+      <w:r>
+        <w:rPr>
+          <w:lang w:val="en-US"/>
+        </w:rPr>
+        <w:t>một bảy mươi</w:t>
+      </w:r>
+      <w:r>
+        <w:t>; đồng thời chia sẻ những kinh nghiệm trong nghiên cứu lý luận chính trị, tổng kết thực tiễn và trao đổi các vấn đề liên quan đến công tác bảo vệ nền tảng tư tưởng của Đảng. Đồng chí nhấn mạnh ý nghĩa của việc tăng cường gắn kết giữa nghiên cứu lý luận với thực tiễn hoạt động của các đơn vị Quân đội, qua đó góp phần bổ sung cơ sở thực tiễn phục vụ công tác nghiên cứu, phát triển lý luận và nâng cao hiệu quả thực hiện nhiệm vụ trong tình hình mới.</w:t>
       </w:r>
     </w:p>
     <w:p>
@@ -53,16 +80,34 @@
     </w:p>
     <w:p>
       <w:r>
-        <w:t xml:space="preserve">Sau buổi trao đổi, Đoàn công tác đã trực tiếp tham quan các tàu thuộc Lữ đoàn 170, tìm hiểu thực tế tổ chức lực lượng, phương tiện và điều kiện thực hiện nhiệm vụ của đơn vị. Hoạt động tham quan góp phần giúp các thành viên trong đoàn có </w:t>
+        <w:t xml:space="preserve">Sau buổi trao đổi, Đoàn công tác đã trực tiếp tham quan các tàu thuộc Lữ đoàn </w:t>
+      </w:r>
+      <w:r>
+        <w:rPr>
+          <w:lang w:val="en-US"/>
+        </w:rPr>
+        <w:t>một bảy mươi</w:t>
+      </w:r>
+      <w:r>
+        <w:t xml:space="preserve">, tìm hiểu thực tế tổ chức lực lượng, phương tiện và điều kiện thực hiện nhiệm vụ của đơn vị. Hoạt động tham quan góp phần giúp các thành viên trong </w:t>
       </w:r>
       <w:r>
         <w:lastRenderedPageBreak/>
-        <w:t>thêm thông tin thực tiễn về môi trường công tác, huấn luyện, sẵn sàng chiến đấu của bộ đội Hải quân, qua đó phục vụ công tác nghiên cứu, tổng kết thực tiễn và phát triển lý luận.</w:t>
+        <w:t>đoàn có thêm thông tin thực tiễn về môi trường công tác, huấn luyện, sẵn sàng chiến đấu của bộ đội Hải quân, qua đó phục vụ công tác nghiên cứu, tổng kết thực tiễn và phát triển lý luận.</w:t>
       </w:r>
     </w:p>
     <w:p>
       <w:r>
-        <w:t>Chuyến công tác là dịp quan trọng để tăng cường trao đổi, chia sẻ kinh nghiệm giữa Học viện Chính trị quốc gia Hồ Chí Minh với Bộ Tư lệnh Vùng 1 Hải quân và Lữ đoàn 170; góp phần nâng cao nhận thức, trách nhiệm trong công tác bảo vệ nền tảng tư tưởng của Đảng, gắn với thực hiện thắng lợi nhiệm vụ bảo vệ vững chắc chủ quyền biển, đảo thiêng liêng của Tổ quốc</w:t>
+        <w:t xml:space="preserve">Chuyến công tác là dịp quan trọng để tăng cường trao đổi, chia sẻ kinh nghiệm giữa Học viện Chính trị quốc gia Hồ Chí Minh với Bộ Tư lệnh Vùng 1 Hải quân và Lữ đoàn </w:t>
+      </w:r>
+      <w:r>
+        <w:rPr>
+          <w:lang w:val="en-US"/>
+        </w:rPr>
+        <w:t>một bảy mươi</w:t>
+      </w:r>
+      <w:r>
+        <w:t>; góp phần nâng cao nhận thức, trách nhiệm trong công tác bảo vệ nền tảng tư tưởng của Đảng, gắn với thực hiện thắng lợi nhiệm vụ bảo vệ vững chắc chủ quyền biển, đảo thiêng liêng của Tổ quốc</w:t>
       </w:r>
     </w:p>
     <w:p/>

</xml_diff>